<commit_message>
added the predsum function
This function is in testing
</commit_message>
<xml_diff>
--- a/R/_PredictionMetrics.docx
+++ b/R/_PredictionMetrics.docx
@@ -6,7 +6,7 @@
       <w:pPr>
         <w:rPr>
           <w:b/>
-          <w:bCs/>
+          <w:color w:val="C00000"/>
         </w:rPr>
       </w:pPr>
       <w:r>
@@ -24,27 +24,7 @@
         <w:t xml:space="preserve"> Function</w:t>
       </w:r>
       <w:r>
-        <w:rPr>
-          <w:b/>
-          <w:bCs/>
-        </w:rPr>
         <w:tab/>
-      </w:r>
-      <w:r>
-        <w:rPr>
-          <w:b/>
-          <w:bCs/>
-          <w:color w:val="C00000"/>
-        </w:rPr>
-        <w:t>Add Your Thoughts</w:t>
-      </w:r>
-      <w:r>
-        <w:rPr>
-          <w:b/>
-          <w:bCs/>
-          <w:color w:val="C00000"/>
-        </w:rPr>
-        <w:t>!</w:t>
       </w:r>
     </w:p>
     <w:p>
@@ -80,7 +60,15 @@
           <w:bCs/>
           <w:u w:val="single"/>
         </w:rPr>
-        <w:t>Input Options:</w:t>
+        <w:t>Function Arguments</w:t>
+      </w:r>
+      <w:r>
+        <w:rPr>
+          <w:b/>
+          <w:bCs/>
+          <w:u w:val="single"/>
+        </w:rPr>
+        <w:t>:</w:t>
       </w:r>
     </w:p>
     <w:p>
@@ -92,7 +80,7 @@
         </w:numPr>
       </w:pPr>
       <w:r>
-        <w:t>A vector of true values, and a vector of predicted classes?</w:t>
+        <w:t>A vector of true values</w:t>
       </w:r>
     </w:p>
     <w:p>
@@ -104,7 +92,7 @@
         </w:numPr>
       </w:pPr>
       <w:r>
-        <w:t>A data frame containing two columns for observations &amp; predictions?</w:t>
+        <w:t xml:space="preserve">A vector of predicted values, these can be dichotomous or scores. </w:t>
       </w:r>
     </w:p>
     <w:p>
@@ -116,7 +104,100 @@
         </w:numPr>
       </w:pPr>
       <w:r>
-        <w:t>Do we want to allow multiple predictions for comparisons?</w:t>
+        <w:t>Cut-off if predicted values are scores, and not dichotomous this must be specified</w:t>
+      </w:r>
+    </w:p>
+    <w:p>
+      <w:pPr>
+        <w:pStyle w:val="ListParagraph"/>
+        <w:numPr>
+          <w:ilvl w:val="0"/>
+          <w:numId w:val="1"/>
+        </w:numPr>
+      </w:pPr>
+      <w:r>
+        <w:t>Confidence interval type (Clopper-Pearson</w:t>
+      </w:r>
+      <w:r>
+        <w:t xml:space="preserve"> or</w:t>
+      </w:r>
+      <w:r>
+        <w:t xml:space="preserve"> Bootstrap)</w:t>
+      </w:r>
+    </w:p>
+    <w:p>
+      <w:pPr>
+        <w:pStyle w:val="ListParagraph"/>
+        <w:numPr>
+          <w:ilvl w:val="0"/>
+          <w:numId w:val="1"/>
+        </w:numPr>
+      </w:pPr>
+      <w:r>
+        <w:t>CI width (default to 0.95)</w:t>
+      </w:r>
+    </w:p>
+    <w:p>
+      <w:pPr>
+        <w:pStyle w:val="ListParagraph"/>
+        <w:numPr>
+          <w:ilvl w:val="0"/>
+          <w:numId w:val="1"/>
+        </w:numPr>
+      </w:pPr>
+      <w:r>
+        <w:t>Argument to separate the point estimate and CI</w:t>
+      </w:r>
+    </w:p>
+    <w:p>
+      <w:pPr>
+        <w:pStyle w:val="ListParagraph"/>
+        <w:numPr>
+          <w:ilvl w:val="0"/>
+          <w:numId w:val="1"/>
+        </w:numPr>
+      </w:pPr>
+      <w:r>
+        <w:t xml:space="preserve">Output </w:t>
+      </w:r>
+      <w:r>
+        <w:t>list</w:t>
+      </w:r>
+      <w:r>
+        <w:t xml:space="preserve"> (</w:t>
+      </w:r>
+      <w:r>
+        <w:t>epi (shown below) data-science (use precision/recall+F1 score, remove sensitivity ppv)</w:t>
+      </w:r>
+      <w:r>
+        <w:t>,</w:t>
+      </w:r>
+      <w:r>
+        <w:t>all</w:t>
+      </w:r>
+      <w:r>
+        <w:t xml:space="preserve">, custom </w:t>
+      </w:r>
+      <w:r>
+        <w:t>(user specifies the vector of statistics they would like</w:t>
+      </w:r>
+      <w:r>
+        <w:t>)</w:t>
+      </w:r>
+      <w:r>
+        <w:t>. Provided as a data frame</w:t>
+      </w:r>
+    </w:p>
+    <w:p>
+      <w:pPr>
+        <w:pStyle w:val="ListParagraph"/>
+        <w:numPr>
+          <w:ilvl w:val="0"/>
+          <w:numId w:val="1"/>
+        </w:numPr>
+      </w:pPr>
+      <w:r>
+        <w:t>tableOnly = FALSE, if true output the data frame, otherwise call reportRmd::outTable() to display</w:t>
       </w:r>
     </w:p>
     <w:p>
@@ -133,91 +214,12 @@
           <w:bCs/>
           <w:u w:val="single"/>
         </w:rPr>
-        <w:t>Function Arguments</w:t>
-      </w:r>
-      <w:r>
-        <w:rPr>
-          <w:b/>
-          <w:bCs/>
-          <w:u w:val="single"/>
-        </w:rPr>
-        <w:t>:</w:t>
+        <w:t>Function Output</w:t>
       </w:r>
     </w:p>
     <w:p>
-      <w:pPr>
-        <w:pStyle w:val="ListParagraph"/>
-        <w:numPr>
-          <w:ilvl w:val="0"/>
-          <w:numId w:val="1"/>
-        </w:numPr>
-      </w:pPr>
-      <w:r>
-        <w:t>Confidence interval type (Clopper-Pearson, Bootstrap, other?)</w:t>
-      </w:r>
-    </w:p>
-    <w:p>
-      <w:pPr>
-        <w:pStyle w:val="ListParagraph"/>
-        <w:numPr>
-          <w:ilvl w:val="0"/>
-          <w:numId w:val="1"/>
-        </w:numPr>
-      </w:pPr>
-      <w:r>
-        <w:t>CI width (default to 0.95)</w:t>
-      </w:r>
-    </w:p>
-    <w:p>
-      <w:pPr>
-        <w:pStyle w:val="ListParagraph"/>
-        <w:numPr>
-          <w:ilvl w:val="0"/>
-          <w:numId w:val="1"/>
-        </w:numPr>
-      </w:pPr>
-      <w:r>
-        <w:t xml:space="preserve">Output </w:t>
-      </w:r>
-      <w:r>
-        <w:t>list</w:t>
-      </w:r>
-      <w:r>
-        <w:t xml:space="preserve"> (full, recommended, custom ?)</w:t>
-      </w:r>
-    </w:p>
-    <w:p>
-      <w:pPr>
-        <w:pStyle w:val="ListParagraph"/>
-        <w:numPr>
-          <w:ilvl w:val="0"/>
-          <w:numId w:val="1"/>
-        </w:numPr>
-      </w:pPr>
-      <w:r>
-        <w:t>Naming style (do we want options for traditional epidemiology + data science?)</w:t>
-      </w:r>
-    </w:p>
-    <w:p>
-      <w:pPr>
-        <w:rPr>
-          <w:b/>
-          <w:bCs/>
-          <w:u w:val="single"/>
-        </w:rPr>
-      </w:pPr>
-      <w:r>
-        <w:rPr>
-          <w:b/>
-          <w:bCs/>
-          <w:u w:val="single"/>
-        </w:rPr>
-        <w:t>Function Output</w:t>
-      </w:r>
-    </w:p>
-    <w:p>
-      <w:r>
-        <w:t>Something like this?</w:t>
+      <w:r>
+        <w:t>This is the “epi” (default) output</w:t>
       </w:r>
     </w:p>
     <w:p>
@@ -409,7 +411,7 @@
           <w:sz w:val="18"/>
           <w:szCs w:val="18"/>
         </w:rPr>
-        <w:t>8       Sample Size               100</w:t>
+        <w:t>8       Sample Size              100</w:t>
       </w:r>
     </w:p>
     <w:p>
@@ -427,10 +429,83 @@
           <w:sz w:val="18"/>
           <w:szCs w:val="18"/>
         </w:rPr>
-        <w:t>9 Positive Category                 1</w:t>
+        <w:t>9             Events               57</w:t>
+      </w:r>
+    </w:p>
+    <w:p>
+      <w:pPr>
+        <w:spacing w:after="0"/>
+        <w:rPr>
+          <w:rFonts w:ascii="Andale Mono" w:hAnsi="Andale Mono"/>
+          <w:sz w:val="18"/>
+          <w:szCs w:val="18"/>
+        </w:rPr>
+      </w:pPr>
+      <w:r>
+        <w:rPr>
+          <w:rFonts w:ascii="Andale Mono" w:hAnsi="Andale Mono"/>
+          <w:sz w:val="18"/>
+          <w:szCs w:val="18"/>
+        </w:rPr>
+        <w:t>10</w:t>
+      </w:r>
+      <w:r>
+        <w:rPr>
+          <w:rFonts w:ascii="Andale Mono" w:hAnsi="Andale Mono"/>
+          <w:sz w:val="18"/>
+          <w:szCs w:val="18"/>
+        </w:rPr>
+        <w:t xml:space="preserve"> Positive Category                1</w:t>
+      </w:r>
+    </w:p>
+    <w:p>
+      <w:pPr>
+        <w:spacing w:after="0"/>
+        <w:rPr>
+          <w:rFonts w:ascii="Andale Mono" w:hAnsi="Andale Mono"/>
+          <w:sz w:val="18"/>
+          <w:szCs w:val="18"/>
+        </w:rPr>
+      </w:pPr>
+      <w:r>
+        <w:rPr>
+          <w:rFonts w:ascii="Andale Mono" w:hAnsi="Andale Mono"/>
+          <w:sz w:val="18"/>
+          <w:szCs w:val="18"/>
+        </w:rPr>
+        <w:t>11          Cut-off</w:t>
       </w:r>
     </w:p>
     <w:p/>
+    <w:p>
+      <w:r>
+        <w:t xml:space="preserve">Other metrics to compute: </w:t>
+      </w:r>
+      <w:r>
+        <w:rPr>
+          <w:rFonts w:ascii="Helvetica" w:hAnsi="Helvetica" w:cs="Helvetica"/>
+          <w:kern w:val="0"/>
+          <w:lang w:val="en-US"/>
+        </w:rPr>
+        <w:t>TP/FP/TN/FN</w:t>
+      </w:r>
+      <w:r>
+        <w:rPr>
+          <w:rFonts w:ascii="Helvetica" w:hAnsi="Helvetica" w:cs="Helvetica"/>
+          <w:kern w:val="0"/>
+          <w:lang w:val="en-US"/>
+        </w:rPr>
+        <w:t>, Brier Score, F1 Score (for data science output) AUC-PR (will replace AUC in the data science output</w:t>
+      </w:r>
+      <w:r>
+        <w:rPr>
+          <w:rFonts w:ascii="Helvetica" w:hAnsi="Helvetica" w:cs="Helvetica"/>
+          <w:kern w:val="0"/>
+          <w:lang w:val="en-US"/>
+        </w:rPr>
+        <w:t xml:space="preserve"> list)</w:t>
+      </w:r>
+    </w:p>
     <w:p>
       <w:r>
         <w:t xml:space="preserve">References </w:t>
@@ -481,6 +556,7 @@
           <w:sz w:val="18"/>
           <w:szCs w:val="18"/>
         </w:rPr>
+        <w:lastRenderedPageBreak/>
         <w:t>McNemar, Q. (1947). Note on the sampling error of the difference between correlated proportions or percentages. Psychometrika, 12(2), 153-157.</w:t>
       </w:r>
     </w:p>

</xml_diff>